<commit_message>
updates to report, fixed splits
</commit_message>
<xml_diff>
--- a/Plan for Deep Learning Final Submission.docx
+++ b/Plan for Deep Learning Final Submission.docx
@@ -60,25 +60,7 @@
         </w:numPr>
       </w:pPr>
       <w:r>
-        <w:t xml:space="preserve">Augmentation of </w:t>
-      </w:r>
-      <w:r>
-        <w:t xml:space="preserve">the </w:t>
-      </w:r>
-      <w:r>
-        <w:t>data means windows have redundant and repeating data</w:t>
-      </w:r>
-      <w:r>
-        <w:t xml:space="preserve"> (80% overlap)</w:t>
-      </w:r>
-      <w:r>
-        <w:t xml:space="preserve">, so </w:t>
-      </w:r>
-      <w:r>
-        <w:t xml:space="preserve">it means </w:t>
-      </w:r>
-      <w:r>
-        <w:t>adjacent windows are nearly identical</w:t>
+        <w:t>Augmentation of the data means windows have redundant and repeating data (80% overlap), so it means adjacent windows are nearly identical</w:t>
       </w:r>
     </w:p>
     <w:p>
@@ -90,22 +72,7 @@
         </w:numPr>
       </w:pPr>
       <w:r>
-        <w:t>For the window</w:t>
-      </w:r>
-      <w:r>
-        <w:t>-level</w:t>
-      </w:r>
-      <w:r>
-        <w:t xml:space="preserve"> model</w:t>
-      </w:r>
-      <w:r>
-        <w:t xml:space="preserve">: patient leakage is OK (that’s the point), but we need to ensure that </w:t>
-      </w:r>
-      <w:r>
-        <w:t xml:space="preserve">the </w:t>
-      </w:r>
-      <w:r>
-        <w:t>Test set doesn’t contain neighbors of any of the windows in the Train set</w:t>
+        <w:t>For the window-level model: patient leakage is OK (that’s the point), but we need to ensure that the Test set doesn’t contain neighbors of any of the windows in the Train set</w:t>
       </w:r>
     </w:p>
     <w:p>
@@ -203,6 +170,7 @@
       </w:r>
     </w:p>
     <w:p/>
+    <w:p/>
     <w:p>
       <w:pPr>
         <w:pStyle w:val="ListParagraph"/>
@@ -212,15 +180,7 @@
         </w:numPr>
       </w:pPr>
       <w:r>
-        <w:t xml:space="preserve">Fix Patient-Level Split - </w:t>
-      </w:r>
-      <w:proofErr w:type="gramStart"/>
-      <w:r>
-        <w:t>Patient</w:t>
-      </w:r>
-      <w:proofErr w:type="gramEnd"/>
-      <w:r>
-        <w:t xml:space="preserve"> 1 and 21 are the same person</w:t>
+        <w:t>Fix Patient-Level Split - Patient 1 and 21 are the same person</w:t>
       </w:r>
     </w:p>
     <w:p/>
@@ -340,7 +300,6 @@
         </w:numPr>
       </w:pPr>
       <w:r>
-        <w:lastRenderedPageBreak/>
         <w:t xml:space="preserve">Temporal Model – LSTM or </w:t>
       </w:r>
       <w:r>
@@ -364,15 +323,7 @@
           <w:bCs/>
           <w:u w:val="single"/>
         </w:rPr>
-        <w:t>Script_ModelExploring</w:t>
-      </w:r>
-      <w:r>
-        <w:rPr>
-          <w:b/>
-          <w:bCs/>
-          <w:u w:val="single"/>
-        </w:rPr>
-        <w:t>.py</w:t>
+        <w:t>Script_ModelExploring.py</w:t>
       </w:r>
       <w:r>
         <w:t xml:space="preserve"> in </w:t>
@@ -426,39 +377,7 @@
         </w:rPr>
       </w:pPr>
       <w:r>
-        <w:t xml:space="preserve">LSTMs </w:t>
-      </w:r>
-      <w:proofErr w:type="gramStart"/>
-      <w:r>
-        <w:t>take into account</w:t>
-      </w:r>
-      <w:proofErr w:type="gramEnd"/>
-      <w:r>
-        <w:t xml:space="preserve"> sequential past to future </w:t>
-      </w:r>
-      <w:proofErr w:type="gramStart"/>
-      <w:r>
-        <w:t>nature,</w:t>
-      </w:r>
-      <w:proofErr w:type="gramEnd"/>
-      <w:r>
-        <w:t xml:space="preserve"> transformers </w:t>
-      </w:r>
-      <w:proofErr w:type="gramStart"/>
-      <w:r>
-        <w:t>take into account</w:t>
-      </w:r>
-      <w:proofErr w:type="gramEnd"/>
-      <w:r>
-        <w:t xml:space="preserve"> a nonlinear sequential order. </w:t>
-      </w:r>
-      <w:proofErr w:type="gramStart"/>
-      <w:r>
-        <w:t>So</w:t>
-      </w:r>
-      <w:proofErr w:type="gramEnd"/>
-      <w:r>
-        <w:t xml:space="preserve"> we would have to justify why a transformer.</w:t>
+        <w:t>LSTMs take into account sequential past to future nature, transformers take into account a nonlinear sequential order. So we would have to justify why a transformer.</w:t>
       </w:r>
     </w:p>
     <w:p>
@@ -472,7 +391,267 @@
     </w:p>
     <w:p>
       <w:r>
+        <w:br w:type="page"/>
+      </w:r>
+    </w:p>
+    <w:p>
+      <w:pPr>
+        <w:rPr>
+          <w:b/>
+          <w:bCs/>
+          <w:u w:val="single"/>
+        </w:rPr>
+      </w:pPr>
+      <w:r>
+        <w:rPr>
+          <w:b/>
+          <w:bCs/>
+          <w:u w:val="single"/>
+        </w:rPr>
+        <w:lastRenderedPageBreak/>
+        <w:t>New feedback</w:t>
+      </w:r>
+    </w:p>
+    <w:p>
+      <w:pPr>
+        <w:rPr>
+          <w:b/>
+          <w:bCs/>
+        </w:rPr>
+      </w:pPr>
+      <w:r>
+        <w:rPr>
+          <w:b/>
+          <w:bCs/>
+        </w:rPr>
+        <w:t>1. The Exclusion Radius is Mathematically Wrong</w:t>
+      </w:r>
+    </w:p>
+    <w:p>
+      <w:r>
+        <w:t xml:space="preserve">Radius </w:t>
+      </w:r>
+      <w:r>
+        <w:t>set to 1, meaning it throws away exactly one window before and one window after the test sample</w:t>
+      </w:r>
+      <w:r>
+        <w:t>, we need to remove more</w:t>
+      </w:r>
+    </w:p>
+    <w:p>
+      <w:r>
+        <w:drawing>
+          <wp:inline distT="0" distB="0" distL="0" distR="0" wp14:anchorId="14597BAC" wp14:editId="47EA2D9B">
+            <wp:extent cx="5943600" cy="2508250"/>
+            <wp:effectExtent l="0" t="0" r="0" b="6350"/>
+            <wp:docPr id="2015042134" name="Picture 1" descr="A screenshot of a computer program&#10;&#10;AI-generated content may be incorrect."/>
+            <wp:cNvGraphicFramePr>
+              <a:graphicFrameLocks xmlns:a="http://schemas.openxmlformats.org/drawingml/2006/main" noChangeAspect="1"/>
+            </wp:cNvGraphicFramePr>
+            <a:graphic xmlns:a="http://schemas.openxmlformats.org/drawingml/2006/main">
+              <a:graphicData uri="http://schemas.openxmlformats.org/drawingml/2006/picture">
+                <pic:pic xmlns:pic="http://schemas.openxmlformats.org/drawingml/2006/picture">
+                  <pic:nvPicPr>
+                    <pic:cNvPr id="2015042134" name="Picture 1" descr="A screenshot of a computer program&#10;&#10;AI-generated content may be incorrect."/>
+                    <pic:cNvPicPr/>
+                  </pic:nvPicPr>
+                  <pic:blipFill>
+                    <a:blip r:embed="rId6"/>
+                    <a:stretch>
+                      <a:fillRect/>
+                    </a:stretch>
+                  </pic:blipFill>
+                  <pic:spPr>
+                    <a:xfrm>
+                      <a:off x="0" y="0"/>
+                      <a:ext cx="5943600" cy="2508250"/>
+                    </a:xfrm>
+                    <a:prstGeom prst="rect">
+                      <a:avLst/>
+                    </a:prstGeom>
+                  </pic:spPr>
+                </pic:pic>
+              </a:graphicData>
+            </a:graphic>
+          </wp:inline>
+        </w:drawing>
+      </w:r>
+    </w:p>
+    <w:p>
+      <w:r>
+        <w:t>2. Deleting Data Unnecessarily (Applying to Normal Windows)</w:t>
+      </w:r>
+    </w:p>
+    <w:p>
+      <w:r>
+        <w:t xml:space="preserve">-normal windows do not have augmentation - </w:t>
+      </w:r>
+      <w:r>
+        <w:t xml:space="preserve"> PDF documentation strictly states: "Non-ictal [normal] windows are non-overlapping".</w:t>
+      </w:r>
+      <w:r>
+        <w:br/>
+      </w:r>
+      <w:r>
+        <w:br/>
+      </w:r>
+      <w:r>
+        <w:t xml:space="preserve">In _build_window_assignments, </w:t>
+      </w:r>
+      <w:r>
+        <w:t xml:space="preserve">we passed </w:t>
+      </w:r>
+      <w:r>
+        <w:rPr>
+          <w:b/>
+          <w:bCs/>
+        </w:rPr>
+        <w:t>all</w:t>
+      </w:r>
+      <w:r>
+        <w:t> test_ids (both normal and seizure windows) into this function. It looks up the chronological position of the window in the EDF file (file_pos) and flags the neighbors to be dropped.</w:t>
+      </w:r>
+      <w:r>
         <w:t xml:space="preserve"> </w:t>
+      </w:r>
+      <w:r>
+        <w:t>Because normal windows already have 0% overlap, there is absolutely no need to drop their neighbors</w:t>
+      </w:r>
+      <w:r>
+        <w:t xml:space="preserve">. </w:t>
+      </w:r>
+      <w:r>
+        <w:t>The exclusion logic should have had a filter to only apply to class_label == 1 (Seizure windows).</w:t>
+      </w:r>
+    </w:p>
+    <w:p>
+      <w:r>
+        <w:drawing>
+          <wp:inline distT="0" distB="0" distL="0" distR="0" wp14:anchorId="62C78AD4" wp14:editId="33F1C205">
+            <wp:extent cx="5943600" cy="2252980"/>
+            <wp:effectExtent l="0" t="0" r="0" b="0"/>
+            <wp:docPr id="184507746" name="Picture 1" descr="A computer screen shot of a computer code&#10;&#10;AI-generated content may be incorrect."/>
+            <wp:cNvGraphicFramePr>
+              <a:graphicFrameLocks xmlns:a="http://schemas.openxmlformats.org/drawingml/2006/main" noChangeAspect="1"/>
+            </wp:cNvGraphicFramePr>
+            <a:graphic xmlns:a="http://schemas.openxmlformats.org/drawingml/2006/main">
+              <a:graphicData uri="http://schemas.openxmlformats.org/drawingml/2006/picture">
+                <pic:pic xmlns:pic="http://schemas.openxmlformats.org/drawingml/2006/picture">
+                  <pic:nvPicPr>
+                    <pic:cNvPr id="184507746" name="Picture 1" descr="A computer screen shot of a computer code&#10;&#10;AI-generated content may be incorrect."/>
+                    <pic:cNvPicPr/>
+                  </pic:nvPicPr>
+                  <pic:blipFill>
+                    <a:blip r:embed="rId7"/>
+                    <a:stretch>
+                      <a:fillRect/>
+                    </a:stretch>
+                  </pic:blipFill>
+                  <pic:spPr>
+                    <a:xfrm>
+                      <a:off x="0" y="0"/>
+                      <a:ext cx="5943600" cy="2252980"/>
+                    </a:xfrm>
+                    <a:prstGeom prst="rect">
+                      <a:avLst/>
+                    </a:prstGeom>
+                  </pic:spPr>
+                </pic:pic>
+              </a:graphicData>
+            </a:graphic>
+          </wp:inline>
+        </w:drawing>
+      </w:r>
+    </w:p>
+    <w:p/>
+    <w:p>
+      <w:r>
+        <w:t xml:space="preserve">3. </w:t>
+      </w:r>
+      <w:r>
+        <w:t xml:space="preserve">Ignoring </w:t>
+      </w:r>
+      <w:r>
+        <w:t>Train vs. Validation Leakage</w:t>
+      </w:r>
+      <w:r>
+        <w:br/>
+      </w:r>
+      <w:r>
+        <w:br/>
+        <w:t xml:space="preserve">We forgot </w:t>
+      </w:r>
+      <w:r>
+        <w:t xml:space="preserve">to apply the exclusion </w:t>
+      </w:r>
+      <w:r>
+        <w:t xml:space="preserve">of overlapped data </w:t>
+      </w:r>
+      <w:r>
+        <w:t>between the Train and Validation sets</w:t>
+      </w:r>
+      <w:r>
+        <w:t>. Since v</w:t>
+      </w:r>
+      <w:r>
+        <w:t>alidation set is used at the end of every epoch to calculate the metric (ROC-AUC) and decide if the model should trigger "Early Stopping"</w:t>
+      </w:r>
+      <w:r>
+        <w:t xml:space="preserve">, this affected training to overfit. </w:t>
+      </w:r>
+      <w:r>
+        <w:t xml:space="preserve">Because train_pool and val_pool were split randomly, an 80%-overlapped seizure window might end up in val_pool while its neighbor is in train_pool. The CNN will simply memorize the overlapping signal, the validation AUC will falsely spike to 99% in the first few epochs, and the training script will save a </w:t>
+      </w:r>
+      <w:r>
+        <w:t xml:space="preserve">strongly </w:t>
+      </w:r>
+      <w:r>
+        <w:t>overfitted</w:t>
+      </w:r>
+      <w:r>
+        <w:t xml:space="preserve"> </w:t>
+      </w:r>
+      <w:r>
+        <w:t>model.</w:t>
+      </w:r>
+    </w:p>
+    <w:p>
+      <w:r>
+        <w:drawing>
+          <wp:inline distT="0" distB="0" distL="0" distR="0" wp14:anchorId="0DE6E58F" wp14:editId="42F5631F">
+            <wp:extent cx="5943600" cy="2900680"/>
+            <wp:effectExtent l="0" t="0" r="0" b="0"/>
+            <wp:docPr id="1127135352" name="Picture 1" descr="A computer screen shot of a program code&#10;&#10;AI-generated content may be incorrect."/>
+            <wp:cNvGraphicFramePr>
+              <a:graphicFrameLocks xmlns:a="http://schemas.openxmlformats.org/drawingml/2006/main" noChangeAspect="1"/>
+            </wp:cNvGraphicFramePr>
+            <a:graphic xmlns:a="http://schemas.openxmlformats.org/drawingml/2006/main">
+              <a:graphicData uri="http://schemas.openxmlformats.org/drawingml/2006/picture">
+                <pic:pic xmlns:pic="http://schemas.openxmlformats.org/drawingml/2006/picture">
+                  <pic:nvPicPr>
+                    <pic:cNvPr id="1127135352" name="Picture 1" descr="A computer screen shot of a program code&#10;&#10;AI-generated content may be incorrect."/>
+                    <pic:cNvPicPr/>
+                  </pic:nvPicPr>
+                  <pic:blipFill>
+                    <a:blip r:embed="rId8"/>
+                    <a:stretch>
+                      <a:fillRect/>
+                    </a:stretch>
+                  </pic:blipFill>
+                  <pic:spPr>
+                    <a:xfrm>
+                      <a:off x="0" y="0"/>
+                      <a:ext cx="5943600" cy="2900680"/>
+                    </a:xfrm>
+                    <a:prstGeom prst="rect">
+                      <a:avLst/>
+                    </a:prstGeom>
+                  </pic:spPr>
+                </pic:pic>
+              </a:graphicData>
+            </a:graphic>
+          </wp:inline>
+        </w:drawing>
       </w:r>
     </w:p>
     <w:sectPr>

</xml_diff>